<commit_message>
Final publication figures, executed notebook, and Word paper with figures embedded
Co-Authored-By: Claude Fable 5.1 <noreply@anthropic.com>
Claude-Session: https://claude.ai/code/session_0115nxZh7Ed7HCfNWPMZoDps
</commit_message>
<xml_diff>
--- a/Paper_LiCo_dolomite_carbonate_site_SCM.docx
+++ b/Paper_LiCo_dolomite_carbonate_site_SCM.docx
@@ -10222,6 +10222,364 @@
       </w:pPr>
       <w:r>
         <w:t>The experimental design for a transferable constant is specified and is a matter of weeks rather than months.</w:t>
+      </w:r>
+    </w:p>
+    <w:p>
+      <w:pPr>
+        <w:pStyle w:val="Heading1"/>
+      </w:pPr>
+      <w:r>
+        <w:t>Figures</w:t>
+      </w:r>
+    </w:p>
+    <w:p>
+      <w:pPr>
+        <w:jc w:val="center"/>
+      </w:pPr>
+      <w:r>
+        <w:drawing>
+          <wp:inline xmlns:a="http://schemas.openxmlformats.org/drawingml/2006/main" xmlns:pic="http://schemas.openxmlformats.org/drawingml/2006/picture">
+            <wp:extent cx="5669280" cy="2382153"/>
+            <wp:docPr id="1" name="Picture 1"/>
+            <wp:cNvGraphicFramePr>
+              <a:graphicFrameLocks noChangeAspect="1"/>
+            </wp:cNvGraphicFramePr>
+            <a:graphic>
+              <a:graphicData uri="http://schemas.openxmlformats.org/drawingml/2006/picture">
+                <pic:pic>
+                  <pic:nvPicPr>
+                    <pic:cNvPr id="0" name="Fig1_kinetics.png"/>
+                    <pic:cNvPicPr/>
+                  </pic:nvPicPr>
+                  <pic:blipFill>
+                    <a:blip r:embed="rId9"/>
+                    <a:stretch>
+                      <a:fillRect/>
+                    </a:stretch>
+                  </pic:blipFill>
+                  <pic:spPr>
+                    <a:xfrm>
+                      <a:off x="0" y="0"/>
+                      <a:ext cx="5669280" cy="2382153"/>
+                    </a:xfrm>
+                    <a:prstGeom prst="rect"/>
+                  </pic:spPr>
+                </pic:pic>
+              </a:graphicData>
+            </a:graphic>
+          </wp:inline>
+        </w:drawing>
+      </w:r>
+    </w:p>
+    <w:p>
+      <w:r>
+        <w:rPr>
+          <w:b/>
+        </w:rPr>
+        <w:t>Figure 1.</w:t>
+      </w:r>
+      <w:r>
+        <w:t xml:space="preserve"> Kinetics of Li⁺ and Co²⁺ uptake by dolomite (60 g L⁻¹, 40 g L⁻¹ NaCl, 25 °C). (a) Removal as a percentage of the initial concentration; (b) surface coverage Γ from Eq. 12, with the carbonate-site density of 14 µmol m⁻² shown. Filled symbols, batches with initial pH 6; open symbols, initial pH 2. Cobalt removal in the pH 6 batch is still rising at day 6; lithium reaches 64 to 72 % of the site density by day 2.</w:t>
+      </w:r>
+    </w:p>
+    <w:p>
+      <w:pPr>
+        <w:jc w:val="center"/>
+      </w:pPr>
+      <w:r>
+        <w:drawing>
+          <wp:inline xmlns:a="http://schemas.openxmlformats.org/drawingml/2006/main" xmlns:pic="http://schemas.openxmlformats.org/drawingml/2006/picture">
+            <wp:extent cx="5669280" cy="2443025"/>
+            <wp:docPr id="2" name="Picture 2"/>
+            <wp:cNvGraphicFramePr>
+              <a:graphicFrameLocks noChangeAspect="1"/>
+            </wp:cNvGraphicFramePr>
+            <a:graphic>
+              <a:graphicData uri="http://schemas.openxmlformats.org/drawingml/2006/picture">
+                <pic:pic>
+                  <pic:nvPicPr>
+                    <pic:cNvPr id="0" name="Fig2_adsorption_edges.png"/>
+                    <pic:cNvPicPr/>
+                  </pic:nvPicPr>
+                  <pic:blipFill>
+                    <a:blip r:embed="rId10"/>
+                    <a:stretch>
+                      <a:fillRect/>
+                    </a:stretch>
+                  </pic:blipFill>
+                  <pic:spPr>
+                    <a:xfrm>
+                      <a:off x="0" y="0"/>
+                      <a:ext cx="5669280" cy="2443025"/>
+                    </a:xfrm>
+                    <a:prstGeom prst="rect"/>
+                  </pic:spPr>
+                </pic:pic>
+              </a:graphicData>
+            </a:graphic>
+          </wp:inline>
+        </w:drawing>
+      </w:r>
+    </w:p>
+    <w:p>
+      <w:r>
+        <w:rPr>
+          <w:b/>
+        </w:rPr>
+        <w:t>Figure 2.</w:t>
+      </w:r>
+      <w:r>
+        <w:t xml:space="preserve"> Adsorption edges. (a) Cobalt and (b) lithium removal against pH. Filled symbols are the day-6 points, open symbols the day-2 and day-4 samples plotted at their measured pH. Model curves are the forward prediction with the apparent constant of Table 6 and each batch's day-6 Ca and Mg (solid, pH 6 batch chemistry; dashed, pH 2 batch chemistry). The dotted line in (b) is the site ceiling: the removal if every carbonate site held lithium.</w:t>
+      </w:r>
+    </w:p>
+    <w:p>
+      <w:pPr>
+        <w:jc w:val="center"/>
+      </w:pPr>
+      <w:r>
+        <w:drawing>
+          <wp:inline xmlns:a="http://schemas.openxmlformats.org/drawingml/2006/main" xmlns:pic="http://schemas.openxmlformats.org/drawingml/2006/picture">
+            <wp:extent cx="5669280" cy="2443025"/>
+            <wp:docPr id="3" name="Picture 3"/>
+            <wp:cNvGraphicFramePr>
+              <a:graphicFrameLocks noChangeAspect="1"/>
+            </wp:cNvGraphicFramePr>
+            <a:graphic>
+              <a:graphicData uri="http://schemas.openxmlformats.org/drawingml/2006/picture">
+                <pic:pic>
+                  <pic:nvPicPr>
+                    <pic:cNvPr id="0" name="Fig3_4_isotherms.png"/>
+                    <pic:cNvPicPr/>
+                  </pic:nvPicPr>
+                  <pic:blipFill>
+                    <a:blip r:embed="rId11"/>
+                    <a:stretch>
+                      <a:fillRect/>
+                    </a:stretch>
+                  </pic:blipFill>
+                  <pic:spPr>
+                    <a:xfrm>
+                      <a:off x="0" y="0"/>
+                      <a:ext cx="5669280" cy="2443025"/>
+                    </a:xfrm>
+                    <a:prstGeom prst="rect"/>
+                  </pic:spPr>
+                </pic:pic>
+              </a:graphicData>
+            </a:graphic>
+          </wp:inline>
+        </w:drawing>
+      </w:r>
+    </w:p>
+    <w:p>
+      <w:r>
+        <w:rPr>
+          <w:b/>
+        </w:rPr>
+        <w:t>Figures 3 and 4.</w:t>
+      </w:r>
+      <w:r>
+        <w:t xml:space="preserve"> Isotherms, log Γ against log C_eq, for (a) cobalt and (b) lithium. Lines are the forward model at the day-6 pH of each batch with the initial concentration varied; symbols are the single measured point of each batch. The unit-slope region is low-coverage adsorption; the flattening toward the dotted line is site saturation. Lithium sits on the saturation shoulder.</w:t>
+      </w:r>
+    </w:p>
+    <w:p>
+      <w:pPr>
+        <w:jc w:val="center"/>
+      </w:pPr>
+      <w:r>
+        <w:drawing>
+          <wp:inline xmlns:a="http://schemas.openxmlformats.org/drawingml/2006/main" xmlns:pic="http://schemas.openxmlformats.org/drawingml/2006/picture">
+            <wp:extent cx="5669280" cy="3580292"/>
+            <wp:docPr id="4" name="Picture 4"/>
+            <wp:cNvGraphicFramePr>
+              <a:graphicFrameLocks noChangeAspect="1"/>
+            </wp:cNvGraphicFramePr>
+            <a:graphic>
+              <a:graphicData uri="http://schemas.openxmlformats.org/drawingml/2006/picture">
+                <pic:pic>
+                  <pic:nvPicPr>
+                    <pic:cNvPr id="0" name="Fig5_Kd_vs_pH.png"/>
+                    <pic:cNvPicPr/>
+                  </pic:nvPicPr>
+                  <pic:blipFill>
+                    <a:blip r:embed="rId12"/>
+                    <a:stretch>
+                      <a:fillRect/>
+                    </a:stretch>
+                  </pic:blipFill>
+                  <pic:spPr>
+                    <a:xfrm>
+                      <a:off x="0" y="0"/>
+                      <a:ext cx="5669280" cy="3580292"/>
+                    </a:xfrm>
+                    <a:prstGeom prst="rect"/>
+                  </pic:spPr>
+                </pic:pic>
+              </a:graphicData>
+            </a:graphic>
+          </wp:inline>
+        </w:drawing>
+      </w:r>
+    </w:p>
+    <w:p>
+      <w:r>
+        <w:rPr>
+          <w:b/>
+        </w:rPr>
+        <w:t>Figure 5.</w:t>
+      </w:r>
+      <w:r>
+        <w:t xml:space="preserve"> Distribution coefficient, log K_d against pH, with the model curves at the pH 6 batch chemistry. The cobalt pH 2 batch points are within analytical noise and are marked as excluded.</w:t>
+      </w:r>
+    </w:p>
+    <w:p>
+      <w:pPr>
+        <w:jc w:val="center"/>
+      </w:pPr>
+      <w:r>
+        <w:drawing>
+          <wp:inline xmlns:a="http://schemas.openxmlformats.org/drawingml/2006/main" xmlns:pic="http://schemas.openxmlformats.org/drawingml/2006/picture">
+            <wp:extent cx="5669280" cy="2495781"/>
+            <wp:docPr id="5" name="Picture 5"/>
+            <wp:cNvGraphicFramePr>
+              <a:graphicFrameLocks noChangeAspect="1"/>
+            </wp:cNvGraphicFramePr>
+            <a:graphic>
+              <a:graphicData uri="http://schemas.openxmlformats.org/drawingml/2006/picture">
+                <pic:pic>
+                  <pic:nvPicPr>
+                    <pic:cNvPr id="0" name="Fig6_logK_diagnostic.png"/>
+                    <pic:cNvPicPr/>
+                  </pic:nvPicPr>
+                  <pic:blipFill>
+                    <a:blip r:embed="rId13"/>
+                    <a:stretch>
+                      <a:fillRect/>
+                    </a:stretch>
+                  </pic:blipFill>
+                  <pic:spPr>
+                    <a:xfrm>
+                      <a:off x="0" y="0"/>
+                      <a:ext cx="5669280" cy="2495781"/>
+                    </a:xfrm>
+                    <a:prstGeom prst="rect"/>
+                  </pic:spPr>
+                </pic:pic>
+              </a:graphicData>
+            </a:graphic>
+          </wp:inline>
+        </w:drawing>
+      </w:r>
+    </w:p>
+    <w:p>
+      <w:r>
+        <w:rPr>
+          <w:b/>
+        </w:rPr>
+        <w:t>Figure 6.</w:t>
+      </w:r>
+      <w:r>
+        <w:t xml:space="preserve"> The flat-line diagnostic: point-by-point log K on the carbonate site against (a) measured pH and (b) surface coverage. Filled symbols are the usable points with the interval obtained by recomputing log K at Γ ∓ σ_Γ (±3 % ICP precision); crosses are the points excluded for being within noise or above sphaerocobaltite saturation. Dashed lines are the weighted fits of Table 6; the dotted line is Pokrovsky et al.'s &gt;CO₃Ca⁺ constant. Lithium is flat in pH but its interval is wide because the surface is near saturation.</w:t>
+      </w:r>
+    </w:p>
+    <w:p>
+      <w:pPr>
+        <w:jc w:val="center"/>
+      </w:pPr>
+      <w:r>
+        <w:drawing>
+          <wp:inline xmlns:a="http://schemas.openxmlformats.org/drawingml/2006/main" xmlns:pic="http://schemas.openxmlformats.org/drawingml/2006/picture">
+            <wp:extent cx="5669280" cy="2382153"/>
+            <wp:docPr id="6" name="Picture 6"/>
+            <wp:cNvGraphicFramePr>
+              <a:graphicFrameLocks noChangeAspect="1"/>
+            </wp:cNvGraphicFramePr>
+            <a:graphic>
+              <a:graphicData uri="http://schemas.openxmlformats.org/drawingml/2006/picture">
+                <pic:pic>
+                  <pic:nvPicPr>
+                    <pic:cNvPr id="0" name="Fig8_Co_sorption_vs_removal_SI.png"/>
+                    <pic:cNvPicPr/>
+                  </pic:nvPicPr>
+                  <pic:blipFill>
+                    <a:blip r:embed="rId14"/>
+                    <a:stretch>
+                      <a:fillRect/>
+                    </a:stretch>
+                  </pic:blipFill>
+                  <pic:spPr>
+                    <a:xfrm>
+                      <a:off x="0" y="0"/>
+                      <a:ext cx="5669280" cy="2382153"/>
+                    </a:xfrm>
+                    <a:prstGeom prst="rect"/>
+                  </pic:spPr>
+                </pic:pic>
+              </a:graphicData>
+            </a:graphic>
+          </wp:inline>
+        </w:drawing>
+      </w:r>
+    </w:p>
+    <w:p>
+      <w:r>
+        <w:rPr>
+          <w:b/>
+        </w:rPr>
+        <w:t>Figure 7.</w:t>
+      </w:r>
+      <w:r>
+        <w:t xml:space="preserve"> Cobalt: (a) measured removal (solid) against the sorption predicted with the analogy constant log K = −0.79 (dashed), for the two batches; (b) saturation index of sphaerocobaltite at the same points, with the supersaturated region shaded. The prediction lies above the measurement at every point (Table 7).</w:t>
+      </w:r>
+    </w:p>
+    <w:p>
+      <w:pPr>
+        <w:jc w:val="center"/>
+      </w:pPr>
+      <w:r>
+        <w:drawing>
+          <wp:inline xmlns:a="http://schemas.openxmlformats.org/drawingml/2006/main" xmlns:pic="http://schemas.openxmlformats.org/drawingml/2006/picture">
+            <wp:extent cx="5669280" cy="3373140"/>
+            <wp:docPr id="7" name="Picture 7"/>
+            <wp:cNvGraphicFramePr>
+              <a:graphicFrameLocks noChangeAspect="1"/>
+            </wp:cNvGraphicFramePr>
+            <a:graphic>
+              <a:graphicData uri="http://schemas.openxmlformats.org/drawingml/2006/picture">
+                <pic:pic>
+                  <pic:nvPicPr>
+                    <pic:cNvPr id="0" name="FigS1_surface_speciation.png"/>
+                    <pic:cNvPicPr/>
+                  </pic:nvPicPr>
+                  <pic:blipFill>
+                    <a:blip r:embed="rId15"/>
+                    <a:stretch>
+                      <a:fillRect/>
+                    </a:stretch>
+                  </pic:blipFill>
+                  <pic:spPr>
+                    <a:xfrm>
+                      <a:off x="0" y="0"/>
+                      <a:ext cx="5669280" cy="3373140"/>
+                    </a:xfrm>
+                    <a:prstGeom prst="rect"/>
+                  </pic:spPr>
+                </pic:pic>
+              </a:graphicData>
+            </a:graphic>
+          </wp:inline>
+        </w:drawing>
+      </w:r>
+    </w:p>
+    <w:p>
+      <w:r>
+        <w:rPr>
+          <w:b/>
+        </w:rPr>
+        <w:t>Figure S1.</w:t>
+      </w:r>
+      <w:r>
+        <w:t xml:space="preserve"> Fractional occupancy of the carbonate site against pH at the cobalt pH 6 batch chemistry, showing the &gt;CO₃H⁰ to &gt;CO₃⁻ transition, the &gt;CO₃Mg⁺ competition and the &gt;CO₃Co⁺ complex.</w:t>
       </w:r>
     </w:p>
     <w:p>

</xml_diff>

<commit_message>
Regenerate the notebook; quote the exchange constant on the NEM value
Co-Authored-By: Claude Opus 5 <noreply@anthropic.com>
Claude-Session: https://claude.ai/code/session_0115nxZh7Ed7HCfNWPMZoDps
</commit_message>
<xml_diff>
--- a/Paper_LiCo_dolomite_carbonate_site_SCM.docx
+++ b/Paper_LiCo_dolomite_carbonate_site_SCM.docx
@@ -8843,16 +8843,16 @@
     </w:p>
     <w:p>
       <w:r>
-        <w:t xml:space="preserve">which cancels the site-density convention and therefore transfers between studies that assumed different densities, as the formation constant does not. With log K(&gt;CO₃Ca⁺) = −1.8 on dolomite, the cobalt bound of −2.20 gives </w:t>
+        <w:t xml:space="preserve">which cancels the site-density convention and therefore transfers between studies that assumed different densities, as the formation constant does not. With log K(&gt;CO₃Ca⁺) = −1.8 on dolomite, the cobalt bound gives </w:t>
       </w:r>
       <w:r>
         <w:rPr>
           <w:b/>
         </w:rPr>
-        <w:t>log K_ex ≥ −0.40</w:t>
+        <w:t>log K_ex ≥ −0.44</w:t>
       </w:r>
       <w:r>
-        <w:t>. Belova et al. (2014) report log K_ex = +0.58 for nickel on calcite and Zachara et al. (1991) +0.51 for the same system. The cobalt bound sits about one log unit below both, which is what the incomplete-equilibration reading predicts and is a more informative comparison than the aqueous analogy alone, since it is a like-for-like comparison of measured exchange constants rather than of a measured value against an estimated one.</w:t>
+        <w:t xml:space="preserve"> on the non-electrostatic value and ≥ −0.40 on the constant-capacitance one. Belova et al. (2014) report log K_ex = +0.58 for nickel on calcite and Zachara et al. (1991) +0.51 for the same system. The cobalt bound sits about one log unit below both, which is what the incomplete-equilibration reading predicts and is a more informative comparison than the aqueous analogy alone, since it is a like-for-like comparison of measured exchange constants rather than of a measured value against an estimated one.</w:t>
       </w:r>
     </w:p>
     <w:p>
@@ -10381,7 +10381,7 @@
     </w:p>
     <w:p>
       <w:r>
-        <w:t>7a. The quantity that transfers between studies is the exchange constant, log K_ex = log K(&gt;CO₃Me) − log K(&gt;CO₃Ca), which cancels the site-density convention. The cobalt bound corresponds to log K_ex ≥ −0.40, about one log unit below the +0.58 of Belova et al. (2014) and the +0.51 of Zachara et al. (1991) for nickel on calcite, which is the direction incomplete equilibration predicts.</w:t>
+        <w:t>7a. The quantity that transfers between studies is the exchange constant, log K_ex = log K(&gt;CO₃Me) − log K(&gt;CO₃Ca), which cancels the site-density convention. The cobalt bound corresponds to log K_ex ≥ −0.44, about one log unit below the +0.58 of Belova et al. (2014) and the +0.51 of Zachara et al. (1991) for nickel on calcite, which is the direction incomplete equilibration predicts.</w:t>
       </w:r>
     </w:p>
     <w:p>

</xml_diff>

<commit_message>
Regenerate notebook, figures and paper with the print style and candidate (d)
Co-Authored-By: Claude Opus 5 <noreply@anthropic.com>
Claude-Session: https://claude.ai/code/session_0115nxZh7Ed7HCfNWPMZoDps
</commit_message>
<xml_diff>
--- a/Paper_LiCo_dolomite_carbonate_site_SCM.docx
+++ b/Paper_LiCo_dolomite_carbonate_site_SCM.docx
@@ -53,7 +53,7 @@
         <w:t>log K(&gt;CO₃Co⁺) ≥ −2.20</w:t>
       </w:r>
       <w:r>
-        <w:t>, rather than as a central value; the ±1.16 is the random component from analytical precision alone and carries no information about the systematic offset from incomplete reaction. The two usable points span only 0.08 pH units, too narrow for the flat-line diagnostic. The constant taken from the aqueous–surface analogy of Van Cappellen et al. (1993) and Pokrovsky and Schott (2002), log K(&gt;CO₃Co⁺) = −0.79, over-predicts the observed cobalt uptake by a factor of 3.5 to 7.4, so precipitation is not required to explain the removal measured in this low-uptake data set; the sorption prediction itself is too high. Ca/Mg competition and precipitation are both ruled out as causes by the data, leaving the borrowed constant, a reactive area of 13 to 29 % of BET (a three- to eight-fold reduction, against the 1.4-fold reduction Belova et al. explored), or incomplete equilibration. The time trend discriminates among these: the predicted sorption is flat to 11 % of its mean across the six days while the measured removal grows 2.3-fold, so the ratio closes monotonically from 7.4 to 3.5. A wrong constant or a reduced reactive area are time-invariant scalings and would hold the ratio flat; a closing ratio is the signature of a system still approaching equilibrium. The time axis is confounded with pH, which rises from 7.40 to 8.09 over the same interval, but the model closes that: its prediction is computed at each point's own measured pH assuming equilibrium, so the prediction is the pH effect with time removed, and it rises only 10 % against the 135 % rise measured. pH therefore accounts for at most 8 % of the observed increase. Crude extrapolation places the meeting point at two to three weeks, so the six-day experiment may simply have stopped too early. Incomplete equilibration in this sense covers two mechanisms that the time trend cannot separate, a slow approach to sorption equilibrium and recrystallization incorporating the cobalt into new lattice, and the extended run is designed to distinguish them (§3.5). Because the analogy value of −0.79 lies above the lower bound, it is not excluded by these data, and a single month-long batch held at fixed pH would settle whether the gap closes; the pH must be held near 7.18 rather than at the drifted value of 8.09, because at 8.09 the run sits above sphaerocobaltite saturation throughout and a closing ratio could equally mean precipitation, and alkalinity must be measured at each sampling because continued dolomite dissolution raises the saturation index in a way a fixed-pCO₂ calculation cannot see. Sorption cannot account for more than 41 % of the cobalt removed in the best previously reported run even if every carbonate site were occupied, which quantifies the coupled sorption–mineralization mechanism proposed earlier. The experimental design required for a genuinely transferable constant is specified.</w:t>
+        <w:t>, rather than as a central value; the ±1.16 is the random component from analytical precision alone and carries no information about the systematic offset from incomplete reaction. The two usable points span only 0.08 pH units, too narrow for the flat-line diagnostic. The constant taken from the aqueous–surface analogy of Van Cappellen et al. (1993) and Pokrovsky and Schott (2002), log K(&gt;CO₃Co⁺) = −0.79, over-predicts the observed cobalt uptake by a factor of 3.5 to 7.4, so precipitation is not required to explain the removal measured in this low-uptake data set; the sorption prediction itself is too high. Ca/Mg competition and precipitation are both ruled out as causes by the data, leaving the borrowed constant, a reactive area of 13 to 29 % of BET (a three- to eight-fold reduction, against the 1.4-fold reduction Belova et al. explored), or incomplete equilibration. The time trend discriminates among these: the predicted sorption is flat to 11 % of its mean across the six days while the measured removal grows 2.3-fold, so the ratio closes monotonically from 7.4 to 3.5. A wrong constant, a reduced reactive area and sodium competition are all time-invariant scalings and would hold the ratio flat; a closing ratio is the signature of a system still approaching equilibrium. This does not exclude the other three, it only shows that none of them can be the whole explanation: any of them could still contribute a constant factor beneath the kinetics, and at 0.684 M sodium competition is the most likely to be doing so. The time axis is confounded with pH, which rises from 7.40 to 8.09 over the same interval, but the model closes that: its prediction is computed at each point's own measured pH assuming equilibrium, so the prediction is the pH effect with time removed, and it rises only 10 % against the 135 % rise measured. pH therefore accounts for at most 8 % of the observed increase. Crude extrapolation places the meeting point at two to three weeks, so the six-day experiment may simply have stopped too early. Incomplete equilibration in this sense covers two mechanisms that the time trend cannot separate, a slow approach to sorption equilibrium and recrystallization incorporating the cobalt into new lattice, and the extended run is designed to distinguish them (§3.5). Because the analogy value of −0.79 lies above the lower bound, it is not excluded by these data, and a single month-long batch held at fixed pH would settle whether the gap closes; the pH must be held near 7.18 rather than at the drifted value of 8.09, because at 8.09 the run sits above sphaerocobaltite saturation throughout and a closing ratio could equally mean precipitation, and alkalinity must be measured at each sampling because continued dolomite dissolution raises the saturation index in a way a fixed-pCO₂ calculation cannot see. Sorption cannot account for more than 41 % of the cobalt removed in the best previously reported run even if every carbonate site were occupied, which quantifies the coupled sorption–mineralization mechanism proposed earlier. The experimental design required for a genuinely transferable constant is specified.</w:t>
       </w:r>
     </w:p>
     <w:p>
@@ -8870,7 +8870,7 @@
     </w:p>
     <w:p>
       <w:r>
-        <w:t>With the constants of Table 3 and log K(&gt;CO₃Co⁺) = −0.79, the forward model predicts that sorption alone would remove 24 to 27 % of the added cobalt in the pH 6 batch and 10 to 21 % in the pH 2 batch, whereas 3.2 to 7.6 % and 0.1 to 1.1 % were removed (Table 7). The signed residual (measured minus predicted) is negative at every point: the model puts 3.5 to 7.4 times more cobalt on the surface than left solution in the pH 6 batch, and far more where the measured removal is within noise. In this coarse, low-uptake system precipitation is therefore not required to explain the removal; the sorption prediction itself is too high by more than a factor of three. Three corrections could each close the gap: (a) the borrowed constant, the usable points giving an apparent value 1.4 log units weaker than the analogy; (b) a reactive area of 13 to 29 % of the BET area, which is a three- to eight-fold reduction, in the same direction as the adjustment Belova et al. (2014) explored but far larger than their 1.4-fold case; (c) incomplete equilibration, since removal is still rising at day 6.</w:t>
+        <w:t>With the constants of Table 3 and log K(&gt;CO₃Co⁺) = −0.79, the forward model predicts that sorption alone would remove 24 to 27 % of the added cobalt in the pH 6 batch and 10 to 21 % in the pH 2 batch, whereas 3.2 to 7.6 % and 0.1 to 1.1 % were removed (Table 7). The signed residual (measured minus predicted) is negative at every point: the model puts 3.5 to 7.4 times more cobalt on the surface than left solution in the pH 6 batch, and far more where the measured removal is within noise. In this coarse, low-uptake system precipitation is therefore not required to explain the removal; the sorption prediction itself is too high by more than a factor of three. Three corrections could each close the gap: (a) the borrowed constant, the usable points giving an apparent value 1.4 log units weaker than the analogy; (b) a reactive area of 13 to 29 % of the BET area, which is a three- to eight-fold reduction, in the same direction as the adjustment Belova et al. (2014) explored but far larger than their 1.4-fold case; (c) incomplete equilibration, since removal is still rising at day 6; and (d) competition from sodium, which the present tableau does not contain. The last is the only candidate with published support on this mineral in this electrolyte. Brady et al. (1999) measured metal sorption on dolomite in NaCl solutions and found calcium and magnesium uptake diminished at 0.5 M NaCl, which they attributed to Na⁺ associating with the dolomite surface and to calcium and magnesium sorbing as hydrated, outer-sphere species. The brine here is 0.684 M, above their case, and the model carries no &gt;CO₃Na⁰ species, so any sodium occupancy of the carbonate site is absent from the site balance and the model over-predicts by that amount. It also challenges the inner-sphere assumption the model inherits from Goldberg (1985).</w:t>
       </w:r>
     </w:p>
     <w:p>
@@ -10420,7 +10420,7 @@
       <w:r>
         <w:drawing>
           <wp:inline xmlns:a="http://schemas.openxmlformats.org/drawingml/2006/main" xmlns:pic="http://schemas.openxmlformats.org/drawingml/2006/picture">
-            <wp:extent cx="5669280" cy="2382153"/>
+            <wp:extent cx="5669280" cy="2324694"/>
             <wp:docPr id="1" name="Picture 1"/>
             <wp:cNvGraphicFramePr>
               <a:graphicFrameLocks noChangeAspect="1"/>
@@ -10441,7 +10441,7 @@
                   <pic:spPr>
                     <a:xfrm>
                       <a:off x="0" y="0"/>
-                      <a:ext cx="5669280" cy="2382153"/>
+                      <a:ext cx="5669280" cy="2324694"/>
                     </a:xfrm>
                     <a:prstGeom prst="rect"/>
                   </pic:spPr>
@@ -10470,7 +10470,7 @@
       <w:r>
         <w:drawing>
           <wp:inline xmlns:a="http://schemas.openxmlformats.org/drawingml/2006/main" xmlns:pic="http://schemas.openxmlformats.org/drawingml/2006/picture">
-            <wp:extent cx="5669280" cy="2443025"/>
+            <wp:extent cx="5669280" cy="2386631"/>
             <wp:docPr id="2" name="Picture 2"/>
             <wp:cNvGraphicFramePr>
               <a:graphicFrameLocks noChangeAspect="1"/>
@@ -10491,7 +10491,7 @@
                   <pic:spPr>
                     <a:xfrm>
                       <a:off x="0" y="0"/>
-                      <a:ext cx="5669280" cy="2443025"/>
+                      <a:ext cx="5669280" cy="2386631"/>
                     </a:xfrm>
                     <a:prstGeom prst="rect"/>
                   </pic:spPr>
@@ -10520,7 +10520,7 @@
       <w:r>
         <w:drawing>
           <wp:inline xmlns:a="http://schemas.openxmlformats.org/drawingml/2006/main" xmlns:pic="http://schemas.openxmlformats.org/drawingml/2006/picture">
-            <wp:extent cx="5669280" cy="2443025"/>
+            <wp:extent cx="5669280" cy="2386631"/>
             <wp:docPr id="3" name="Picture 3"/>
             <wp:cNvGraphicFramePr>
               <a:graphicFrameLocks noChangeAspect="1"/>
@@ -10541,7 +10541,7 @@
                   <pic:spPr>
                     <a:xfrm>
                       <a:off x="0" y="0"/>
-                      <a:ext cx="5669280" cy="2443025"/>
+                      <a:ext cx="5669280" cy="2386631"/>
                     </a:xfrm>
                     <a:prstGeom prst="rect"/>
                   </pic:spPr>
@@ -10570,7 +10570,7 @@
       <w:r>
         <w:drawing>
           <wp:inline xmlns:a="http://schemas.openxmlformats.org/drawingml/2006/main" xmlns:pic="http://schemas.openxmlformats.org/drawingml/2006/picture">
-            <wp:extent cx="5669280" cy="3580292"/>
+            <wp:extent cx="5669280" cy="3527684"/>
             <wp:docPr id="4" name="Picture 4"/>
             <wp:cNvGraphicFramePr>
               <a:graphicFrameLocks noChangeAspect="1"/>
@@ -10591,7 +10591,7 @@
                   <pic:spPr>
                     <a:xfrm>
                       <a:off x="0" y="0"/>
-                      <a:ext cx="5669280" cy="3580292"/>
+                      <a:ext cx="5669280" cy="3527684"/>
                     </a:xfrm>
                     <a:prstGeom prst="rect"/>
                   </pic:spPr>
@@ -10620,7 +10620,7 @@
       <w:r>
         <w:drawing>
           <wp:inline xmlns:a="http://schemas.openxmlformats.org/drawingml/2006/main" xmlns:pic="http://schemas.openxmlformats.org/drawingml/2006/picture">
-            <wp:extent cx="5669280" cy="2495781"/>
+            <wp:extent cx="5669280" cy="2440309"/>
             <wp:docPr id="5" name="Picture 5"/>
             <wp:cNvGraphicFramePr>
               <a:graphicFrameLocks noChangeAspect="1"/>
@@ -10641,7 +10641,7 @@
                   <pic:spPr>
                     <a:xfrm>
                       <a:off x="0" y="0"/>
-                      <a:ext cx="5669280" cy="2495781"/>
+                      <a:ext cx="5669280" cy="2440309"/>
                     </a:xfrm>
                     <a:prstGeom prst="rect"/>
                   </pic:spPr>
@@ -10670,7 +10670,7 @@
       <w:r>
         <w:drawing>
           <wp:inline xmlns:a="http://schemas.openxmlformats.org/drawingml/2006/main" xmlns:pic="http://schemas.openxmlformats.org/drawingml/2006/picture">
-            <wp:extent cx="5669280" cy="1641770"/>
+            <wp:extent cx="5669280" cy="1593512"/>
             <wp:docPr id="6" name="Picture 6"/>
             <wp:cNvGraphicFramePr>
               <a:graphicFrameLocks noChangeAspect="1"/>
@@ -10691,7 +10691,7 @@
                   <pic:spPr>
                     <a:xfrm>
                       <a:off x="0" y="0"/>
-                      <a:ext cx="5669280" cy="1641770"/>
+                      <a:ext cx="5669280" cy="1593512"/>
                     </a:xfrm>
                     <a:prstGeom prst="rect"/>
                   </pic:spPr>
@@ -10720,7 +10720,7 @@
       <w:r>
         <w:drawing>
           <wp:inline xmlns:a="http://schemas.openxmlformats.org/drawingml/2006/main" xmlns:pic="http://schemas.openxmlformats.org/drawingml/2006/picture">
-            <wp:extent cx="5669280" cy="3373140"/>
+            <wp:extent cx="5669280" cy="3318739"/>
             <wp:docPr id="7" name="Picture 7"/>
             <wp:cNvGraphicFramePr>
               <a:graphicFrameLocks noChangeAspect="1"/>
@@ -10741,7 +10741,7 @@
                   <pic:spPr>
                     <a:xfrm>
                       <a:off x="0" y="0"/>
-                      <a:ext cx="5669280" cy="3373140"/>
+                      <a:ext cx="5669280" cy="3318739"/>
                     </a:xfrm>
                     <a:prstGeom prst="rect"/>
                   </pic:spPr>
@@ -10796,6 +10796,20 @@
       </w:r>
       <w:r>
         <w:t>, 1–9. https://doi.org/10.1016/j.jconhyd.2014.09.007</w:t>
+      </w:r>
+    </w:p>
+    <w:p>
+      <w:r>
+        <w:t xml:space="preserve">Brady, P. V., Papenguth, H. W., &amp; Kelly, J. W. (1999). Metal sorption to dolomite surfaces. </w:t>
+      </w:r>
+      <w:r>
+        <w:rPr>
+          <w:i/>
+        </w:rPr>
+        <w:t>Applied Geochemistry, 14</w:t>
+      </w:r>
+      <w:r>
+        <w:t>(5), 569–579. https://doi.org/10.1016/S0883-2927(98)00085-7</w:t>
       </w:r>
     </w:p>
     <w:p>

</xml_diff>